<commit_message>
added previous season to model, created interaction model, decided to pool all season in final model
</commit_message>
<xml_diff>
--- a/project-report.docx
+++ b/project-report.docx
@@ -7,10 +7,18 @@
         <w:pStyle w:val="Title"/>
       </w:pPr>
       <w:r>
-        <w:t xml:space="preserve">Project Report</w:t>
-      </w:r>
-    </w:p>
-    <w:bookmarkStart w:id="20" w:name="research-question"/>
+        <w:t xml:space="preserve">Draft Class Strength and NBA Tanking Incentives</w:t>
+      </w:r>
+    </w:p>
+    <w:p>
+      <w:pPr>
+        <w:pStyle w:val="Author"/>
+      </w:pPr>
+      <w:r>
+        <w:t xml:space="preserve">Nico L, Leo K, Colin C</w:t>
+      </w:r>
+    </w:p>
+    <w:bookmarkStart w:id="23" w:name="research-question"/>
     <w:p>
       <w:pPr>
         <w:pStyle w:val="Heading2"/>
@@ -34,7 +42,7 @@
           <w:b/>
           <w:bCs/>
         </w:rPr>
-        <w:t xml:space="preserve">Do stronger NBA draft classes create stronger incentives for likely lottery teams to underperform late in the regular season?</w:t>
+        <w:t xml:space="preserve">Are stronger NBA draft classes associated with more late-season underperformance among teams with weak playoff outlooks, and did this relationship change after the NBA flattened the draft lottery odds?</w:t>
       </w:r>
     </w:p>
     <w:p>
@@ -42,17 +50,94 @@
         <w:pStyle w:val="BodyText"/>
       </w:pPr>
       <w:r>
-        <w:t xml:space="preserve">While research has been done examining the value for an NBA team to underperform, many focus solely on the benefit of lottery odds, treating the actual players obtainable as a fixed variable. While many articles highlight the increase in tanking, with many different methods of quantifying it (blowout wins, teams underperforming their expected win pct, etc.), they stop short at examining factors like the fixed shift to the flattened lottery curve. We are interested in investigating whether tanking actually significantly fluctuates from season to season as a result of variation in the quality of players entering the league.</w:t>
-      </w:r>
-    </w:p>
-    <w:bookmarkEnd w:id="20"/>
-    <w:bookmarkStart w:id="21" w:name="dataset-overview"/>
+        <w:t xml:space="preserve">This question is about incentives, but our data cannot directly observe intent. We therefore measure</w:t>
+      </w:r>
+      <w:r>
+        <w:t xml:space="preserve"> </w:t>
+      </w:r>
+      <w:r>
+        <w:rPr>
+          <w:b/>
+          <w:bCs/>
+        </w:rPr>
+        <w:t xml:space="preserve">tanking signals</w:t>
+      </w:r>
+      <w:r>
+        <w:t xml:space="preserve">, not confirmed tanking. A tanking signal is a team-season where a team had a weak postseason outlook entering March and then performed worse than expected late in the regular season. This framing is important because a team can lose late-season games for many reasons, including injuries, player development, fatigue, roster trades, or strategic resting.</w:t>
+      </w:r>
+    </w:p>
+    <w:p>
+      <w:pPr>
+        <w:pStyle w:val="BodyText"/>
+      </w:pPr>
+      <w:r>
+        <w:t xml:space="preserve">Prior research has studied tanking as a response to draft lottery incentives.</w:t>
+      </w:r>
+      <w:r>
+        <w:t xml:space="preserve"> </w:t>
+      </w:r>
+      <w:hyperlink r:id="rId20">
+        <w:r>
+          <w:rPr>
+            <w:rStyle w:val="Hyperlink"/>
+          </w:rPr>
+          <w:t xml:space="preserve">Taylor and Trogdon (2002)</w:t>
+        </w:r>
+      </w:hyperlink>
+      <w:r>
+        <w:t xml:space="preserve"> </w:t>
+      </w:r>
+      <w:r>
+        <w:t xml:space="preserve">and</w:t>
+      </w:r>
+      <w:r>
+        <w:t xml:space="preserve"> </w:t>
+      </w:r>
+      <w:hyperlink r:id="rId21">
+        <w:r>
+          <w:rPr>
+            <w:rStyle w:val="Hyperlink"/>
+          </w:rPr>
+          <w:t xml:space="preserve">Price et al. (2010)</w:t>
+        </w:r>
+      </w:hyperlink>
+      <w:r>
+        <w:t xml:space="preserve"> </w:t>
+      </w:r>
+      <w:r>
+        <w:t xml:space="preserve">examine whether NBA teams lose more often when the reward for losing is larger. Our project builds on that idea by adding a second source of incentive: the quality of the incoming draft class. Instead of treating every draft as equally valuable, we ask whether likely lottery teams appear to underperform more in years when the player pool at the top of the draft is stronger.</w:t>
+      </w:r>
+    </w:p>
+    <w:p>
+      <w:pPr>
+        <w:pStyle w:val="BodyText"/>
+      </w:pPr>
+      <w:r>
+        <w:t xml:space="preserve">The pre/post reform part of the question matters because the</w:t>
+      </w:r>
+      <w:r>
+        <w:t xml:space="preserve"> </w:t>
+      </w:r>
+      <w:hyperlink r:id="rId22">
+        <w:r>
+          <w:rPr>
+            <w:rStyle w:val="Hyperlink"/>
+          </w:rPr>
+          <w:t xml:space="preserve">NBA changed its lottery odds beginning with the 2019 draft</w:t>
+        </w:r>
+      </w:hyperlink>
+      <w:r>
+        <w:t xml:space="preserve">. Under the newer system, the three worst regular-season teams each receive a 14 percent chance of winning the No. 1 pick. This flattened the reward for finishing with the very worst record, but it did not remove the broader value of landing high in a strong draft.</w:t>
+      </w:r>
+    </w:p>
+    <w:bookmarkEnd w:id="23"/>
+    <w:bookmarkStart w:id="26" w:name="dataset"/>
     <w:p>
       <w:pPr>
         <w:pStyle w:val="Heading2"/>
       </w:pPr>
       <w:r>
-        <w:t xml:space="preserve">Dataset Overview</w:t>
+        <w:t xml:space="preserve">Dataset</w:t>
       </w:r>
     </w:p>
     <w:p>
@@ -60,7 +145,74 @@
         <w:pStyle w:val="FirstParagraph"/>
       </w:pPr>
       <w:r>
-        <w:t xml:space="preserve">We mainly use data from two main sources:</w:t>
+        <w:t xml:space="preserve">We use two main sources. First, NBA team game logs come from the</w:t>
+      </w:r>
+      <w:r>
+        <w:t xml:space="preserve"> </w:t>
+      </w:r>
+      <w:hyperlink r:id="rId24">
+        <w:r>
+          <w:rPr>
+            <w:rStyle w:val="VerbatimChar"/>
+          </w:rPr>
+          <w:t xml:space="preserve">hoopR</w:t>
+        </w:r>
+      </w:hyperlink>
+      <w:r>
+        <w:t xml:space="preserve"> </w:t>
+      </w:r>
+      <w:r>
+        <w:t xml:space="preserve">package, which provides team-level NBA game results. These data include the game date, team, opponent, score, and win/loss result. Second, draft class quality comes from</w:t>
+      </w:r>
+      <w:r>
+        <w:t xml:space="preserve"> </w:t>
+      </w:r>
+      <w:hyperlink r:id="rId25">
+        <w:r>
+          <w:rPr>
+            <w:rStyle w:val="Hyperlink"/>
+          </w:rPr>
+          <w:t xml:space="preserve">CraftedNBA draft class rankings</w:t>
+        </w:r>
+      </w:hyperlink>
+      <w:r>
+        <w:t xml:space="preserve">, which rate draft classes from 2010 through 2026. The main draft-quality variable is</w:t>
+      </w:r>
+      <w:r>
+        <w:t xml:space="preserve"> </w:t>
+      </w:r>
+      <w:r>
+        <w:rPr>
+          <w:rStyle w:val="VerbatimChar"/>
+        </w:rPr>
+        <w:t xml:space="preserve">avg_rating</w:t>
+      </w:r>
+      <w:r>
+        <w:t xml:space="preserve">, the average rating of the top 35 prospects in that draft class. We also keep the number of elite prospects, number of above-average prospects, and rating of the top prospect as alternate draft-strength measures.</w:t>
+      </w:r>
+    </w:p>
+    <w:p>
+      <w:pPr>
+        <w:pStyle w:val="BodyText"/>
+      </w:pPr>
+      <w:r>
+        <w:t xml:space="preserve">The final dataset contains 510 team-seasons from 2010 through 2026. Each row is one team in one season. Draft quality changes only at the season level, so the analysis has 17 draft-class observations, not 510 independent draft-strength observations. This is one of the main limitations of the project and is why we interpret the model results cautiously.</w:t>
+      </w:r>
+    </w:p>
+    <w:p>
+      <w:pPr>
+        <w:pStyle w:val="BodyText"/>
+      </w:pPr>
+      <w:r>
+        <w:t xml:space="preserve">We split each season at March 1. The pre-March portion gives a baseline estimate of team strength before the final stretch of the regular season. The March-onward portion is the window where late-season incentives are more likely to matter.</w:t>
+      </w:r>
+    </w:p>
+    <w:p>
+      <w:pPr>
+        <w:pStyle w:val="BodyText"/>
+      </w:pPr>
+      <w:r>
+        <w:t xml:space="preserve">Key constructed variables:</w:t>
       </w:r>
     </w:p>
     <w:p>
@@ -73,13 +225,12 @@
       </w:pPr>
       <w:r>
         <w:rPr>
-          <w:b/>
-          <w:bCs/>
+          <w:rStyle w:val="VerbatimChar"/>
         </w:rPr>
-        <w:t xml:space="preserve">NBA team game logs from hoopR</w:t>
-      </w:r>
-      <w:r>
-        <w:t xml:space="preserve">: regular-season team box scores from the NBA seasons ending in 2019 through 2026. This is done because the lottery odds were changed in the 2019 season.</w:t>
+        <w:t xml:space="preserve">pre_win_pct</w:t>
+      </w:r>
+      <w:r>
+        <w:t xml:space="preserve">: team win percentage before March 1.</w:t>
       </w:r>
     </w:p>
     <w:p>
@@ -92,29 +243,12 @@
       </w:pPr>
       <w:r>
         <w:rPr>
-          <w:b/>
-          <w:bCs/>
+          <w:rStyle w:val="VerbatimChar"/>
         </w:rPr>
-        <w:t xml:space="preserve">CraftedNBA draft class rankings</w:t>
-      </w:r>
-      <w:r>
-        <w:t xml:space="preserve">: We use their draft-year ratings as an external measure of class strength. Key variables include average class rating, number of elite prospects, number of above-average prospects, and top prospect rating. We don’t know entirely how these are modeled, but it allows us to have a consistent measure of draft strength that doesn’t have retrospective bias.</w:t>
-      </w:r>
-    </w:p>
-    <w:p>
-      <w:pPr>
-        <w:pStyle w:val="FirstParagraph"/>
-      </w:pPr>
-      <w:r>
-        <w:t xml:space="preserve">We merge these dataframes together (after summarizing the nba data by season and team) to create a team-season dataframe. We then split the data into pre and post march to create a window of time where tanking effects are more likely to appear.</w:t>
-      </w:r>
-    </w:p>
-    <w:p>
-      <w:pPr>
-        <w:pStyle w:val="BodyText"/>
-      </w:pPr>
-      <w:r>
-        <w:t xml:space="preserve">Key variables created for this analysis:</w:t>
+        <w:t xml:space="preserve">late_win_pct</w:t>
+      </w:r>
+      <w:r>
+        <w:t xml:space="preserve">: team win percentage on or after March 1.</w:t>
       </w:r>
     </w:p>
     <w:p>
@@ -122,17 +256,17 @@
         <w:pStyle w:val="Compact"/>
         <w:numPr>
           <w:ilvl w:val="0"/>
-          <w:numId w:val="1002"/>
+          <w:numId w:val="1001"/>
         </w:numPr>
       </w:pPr>
       <w:r>
         <w:rPr>
           <w:rStyle w:val="VerbatimChar"/>
         </w:rPr>
-        <w:t xml:space="preserve">pre_win_pct</w:t>
-      </w:r>
-      <w:r>
-        <w:t xml:space="preserve">: team win percentage before March 1.</w:t>
+        <w:t xml:space="preserve">games_back_cutline</w:t>
+      </w:r>
+      <w:r>
+        <w:t xml:space="preserve">: games behind the postseason/play-in cutoff entering March. For seasons before the play-in era, the cutoff is the 8th seed. For seasons beginning in 2021, the cutoff is the 10th seed.</w:t>
       </w:r>
     </w:p>
     <w:p>
@@ -140,43 +274,7 @@
         <w:pStyle w:val="Compact"/>
         <w:numPr>
           <w:ilvl w:val="0"/>
-          <w:numId w:val="1002"/>
-        </w:numPr>
-      </w:pPr>
-      <w:r>
-        <w:rPr>
-          <w:rStyle w:val="VerbatimChar"/>
-        </w:rPr>
-        <w:t xml:space="preserve">late_win_pct</w:t>
-      </w:r>
-      <w:r>
-        <w:t xml:space="preserve">: team win percentage on or after March 1.</w:t>
-      </w:r>
-    </w:p>
-    <w:p>
-      <w:pPr>
-        <w:pStyle w:val="Compact"/>
-        <w:numPr>
-          <w:ilvl w:val="0"/>
-          <w:numId w:val="1002"/>
-        </w:numPr>
-      </w:pPr>
-      <w:r>
-        <w:rPr>
-          <w:rStyle w:val="VerbatimChar"/>
-        </w:rPr>
-        <w:t xml:space="preserve">games_back_10</w:t>
-      </w:r>
-      <w:r>
-        <w:t xml:space="preserve">: games behind the 10th seed in the conference entering March, which approximates distance from the play-in race.</w:t>
-      </w:r>
-    </w:p>
-    <w:p>
-      <w:pPr>
-        <w:pStyle w:val="Compact"/>
-        <w:numPr>
-          <w:ilvl w:val="0"/>
-          <w:numId w:val="1002"/>
+          <w:numId w:val="1001"/>
         </w:numPr>
       </w:pPr>
       <w:r>
@@ -186,7 +284,7 @@
         <w:t xml:space="preserve">likely_lottery_candidate</w:t>
       </w:r>
       <w:r>
-        <w:t xml:space="preserve">: whether the team was outside the top 10 in its conference and either at least 3 games behind the 10th seed or below a .400 pre-March win percentage.</w:t>
+        <w:t xml:space="preserve">: a team outside the relevant postseason cutoff that was either at least 3 games behind the cutoff or below a .400 pre-March win percentage.</w:t>
       </w:r>
     </w:p>
     <w:p>
@@ -194,7 +292,7 @@
         <w:pStyle w:val="Compact"/>
         <w:numPr>
           <w:ilvl w:val="0"/>
-          <w:numId w:val="1002"/>
+          <w:numId w:val="1001"/>
         </w:numPr>
       </w:pPr>
       <w:r>
@@ -204,7 +302,7 @@
         <w:t xml:space="preserve">tanking_index</w:t>
       </w:r>
       <w:r>
-        <w:t xml:space="preserve">: standardized late-season win shortfall. Positive values mean a team won fewer late-season games than expected from its pre-March record.</w:t>
+        <w:t xml:space="preserve">: standardized late-season win shortfall. Positive values mean a team won fewer March-onward games than expected from its pre-March record.</w:t>
       </w:r>
     </w:p>
     <w:p>
@@ -212,7 +310,7 @@
         <w:pStyle w:val="Compact"/>
         <w:numPr>
           <w:ilvl w:val="0"/>
-          <w:numId w:val="1002"/>
+          <w:numId w:val="1001"/>
         </w:numPr>
       </w:pPr>
       <w:r>
@@ -222,7 +320,7 @@
         <w:t xml:space="preserve">tanking_proxy</w:t>
       </w:r>
       <w:r>
-        <w:t xml:space="preserve">: a binary flag for likely lottery candidates whose late win percentage dropped by at least 10 percentage points and whose late wins were unusually low under a binomial expectation.</w:t>
+        <w:t xml:space="preserve">: a conservative yes/no flag for likely lottery candidates whose late win percentage dropped by at least 10 percentage points and whose late wins were unusually low under a binomial expectation.</w:t>
       </w:r>
     </w:p>
     <w:p>
@@ -230,7 +328,7 @@
         <w:pStyle w:val="Compact"/>
         <w:numPr>
           <w:ilvl w:val="0"/>
-          <w:numId w:val="1002"/>
+          <w:numId w:val="1001"/>
         </w:numPr>
       </w:pPr>
       <w:r>
@@ -240,7 +338,7 @@
         <w:t xml:space="preserve">lower_left_candidate</w:t>
       </w:r>
       <w:r>
-        <w:t xml:space="preserve">: a likely lottery team that was below .500 both before March and after March. This captures teams that were consistently weak, even if they did not sharply collapse late in the year.</w:t>
+        <w:t xml:space="preserve">: a likely lottery candidate that was below .500 both before March and after March. This captures teams that remained very weak late in the season, even if they did not sharply collapse.</w:t>
       </w:r>
     </w:p>
     <w:p>
@@ -248,7 +346,7 @@
         <w:pStyle w:val="Compact"/>
         <w:numPr>
           <w:ilvl w:val="0"/>
-          <w:numId w:val="1002"/>
+          <w:numId w:val="1001"/>
         </w:numPr>
       </w:pPr>
       <w:r>
@@ -258,7 +356,7 @@
         <w:t xml:space="preserve">late_low_win_score</w:t>
       </w:r>
       <w:r>
-        <w:t xml:space="preserve">: a secondary continuous outcome that measures how far below .500 a likely lottery team’s late-season win percentage was.</w:t>
+        <w:t xml:space="preserve">: a secondary continuous outcome measuring how far below .500 a likely lottery team’s late-season win percentage was.</w:t>
       </w:r>
     </w:p>
     <w:p>
@@ -266,17 +364,35 @@
         <w:pStyle w:val="Compact"/>
         <w:numPr>
           <w:ilvl w:val="0"/>
-          <w:numId w:val="1002"/>
+          <w:numId w:val="1001"/>
         </w:numPr>
       </w:pPr>
       <w:r>
         <w:rPr>
           <w:rStyle w:val="VerbatimChar"/>
         </w:rPr>
-        <w:t xml:space="preserve">season_2021</w:t>
-      </w:r>
-      <w:r>
-        <w:t xml:space="preserve">: an indicator for the 2020-21 NBA season, which was shortened to 72 games and affected by COVID-era scheduling, roster, and availability disruptions.</w:t>
+        <w:t xml:space="preserve">post_reform</w:t>
+      </w:r>
+      <w:r>
+        <w:t xml:space="preserve">: whether the season occurred after the 2019 lottery reform.</w:t>
+      </w:r>
+    </w:p>
+    <w:p>
+      <w:pPr>
+        <w:pStyle w:val="Compact"/>
+        <w:numPr>
+          <w:ilvl w:val="0"/>
+          <w:numId w:val="1001"/>
+        </w:numPr>
+      </w:pPr>
+      <w:r>
+        <w:rPr>
+          <w:rStyle w:val="VerbatimChar"/>
+        </w:rPr>
+        <w:t xml:space="preserve">disrupted_season</w:t>
+      </w:r>
+      <w:r>
+        <w:t xml:space="preserve">: whether the season was shortened or highly disrupted. This includes 2012, 2020, and 2021.</w:t>
       </w:r>
     </w:p>
     <w:p>
@@ -284,11 +400,26 @@
         <w:pStyle w:val="FirstParagraph"/>
       </w:pPr>
       <w:r>
-        <w:t xml:space="preserve">This definition is intentionally conservative. It does not claim to prove intent. It flags team-seasons where the incentive to lose plausibly existed and where late-season performance was meaningfully worse than expected.</w:t>
-      </w:r>
-    </w:p>
-    <w:bookmarkEnd w:id="21"/>
-    <w:bookmarkStart w:id="29" w:name="exploratory-analysis"/>
+        <w:t xml:space="preserve">The</w:t>
+      </w:r>
+      <w:r>
+        <w:t xml:space="preserve"> </w:t>
+      </w:r>
+      <w:r>
+        <w:rPr>
+          <w:rStyle w:val="VerbatimChar"/>
+        </w:rPr>
+        <w:t xml:space="preserve">tanking_index</w:t>
+      </w:r>
+      <w:r>
+        <w:t xml:space="preserve"> </w:t>
+      </w:r>
+      <w:r>
+        <w:t xml:space="preserve">is the main outcome because it uses more information than a simple cutoff. For example, the 2021 Rockets were 11-21 before March, a .344 win percentage. If they had kept winning at that rate over their 40 March-onward games, they would have been expected to win about 13.8 games. They won 6, leaving a shortfall of 7.8 wins and a tanking index of 2.58. This does not prove intent, but it identifies a large late-season underperformance relative to that team’s own earlier baseline.</w:t>
+      </w:r>
+    </w:p>
+    <w:bookmarkEnd w:id="26"/>
+    <w:bookmarkStart w:id="33" w:name="exploratory-analysis"/>
     <w:p>
       <w:pPr>
         <w:pStyle w:val="Heading2"/>
@@ -297,13 +428,12 @@
         <w:t xml:space="preserve">Exploratory Analysis</w:t>
       </w:r>
     </w:p>
-    <w:bookmarkStart w:id="28" w:name="summary-statistics"/>
-    <w:p>
-      <w:pPr>
-        <w:pStyle w:val="Heading3"/>
-      </w:pPr>
-      <w:r>
-        <w:t xml:space="preserve">Summary Statistics</w:t>
+    <w:p>
+      <w:pPr>
+        <w:pStyle w:val="TableCaption"/>
+      </w:pPr>
+      <w:r>
+        <w:t xml:space="preserve">Table 1. Summary statistics by lottery era and team group.</w:t>
       </w:r>
     </w:p>
     <w:tbl>
@@ -312,16 +442,17 @@
         <w:tblW w:type="pct" w:w="5000"/>
         <w:tblLayout w:type="fixed"/>
         <w:tblLook w:firstRow="1" w:lastRow="0" w:firstColumn="0" w:lastColumn="0" w:noHBand="0" w:noVBand="0" w:val="0020"/>
+        <w:tblCaption w:val="Table 1. Summary statistics by lottery era and team group."/>
       </w:tblPr>
       <w:tblGrid>
-        <w:gridCol w:w="1211"/>
-        <w:gridCol w:w="605"/>
-        <w:gridCol w:w="1071"/>
-        <w:gridCol w:w="838"/>
-        <w:gridCol w:w="931"/>
-        <w:gridCol w:w="885"/>
-        <w:gridCol w:w="1024"/>
-        <w:gridCol w:w="1351"/>
+        <w:gridCol w:w="1440"/>
+        <w:gridCol w:w="1560"/>
+        <w:gridCol w:w="240"/>
+        <w:gridCol w:w="720"/>
+        <w:gridCol w:w="780"/>
+        <w:gridCol w:w="840"/>
+        <w:gridCol w:w="1140"/>
+        <w:gridCol w:w="1200"/>
       </w:tblGrid>
       <w:tr>
         <w:trPr>
@@ -335,91 +466,91 @@
               <w:jc w:val="left"/>
             </w:pPr>
             <w:r>
-              <w:t xml:space="preserve">group</w:t>
-            </w:r>
-          </w:p>
-        </w:tc>
-        <w:tc>
-          <w:tcPr/>
-          <w:p>
-            <w:pPr>
-              <w:pStyle w:val="Compact"/>
-              <w:jc w:val="right"/>
-            </w:pPr>
-            <w:r>
-              <w:t xml:space="preserve">Team-seasons</w:t>
-            </w:r>
-          </w:p>
-        </w:tc>
-        <w:tc>
-          <w:tcPr/>
-          <w:p>
-            <w:pPr>
-              <w:pStyle w:val="Compact"/>
-              <w:jc w:val="right"/>
-            </w:pPr>
-            <w:r>
-              <w:t xml:space="preserve">Avg. pre-March win pct</w:t>
-            </w:r>
-          </w:p>
-        </w:tc>
-        <w:tc>
-          <w:tcPr/>
-          <w:p>
-            <w:pPr>
-              <w:pStyle w:val="Compact"/>
-              <w:jc w:val="right"/>
-            </w:pPr>
-            <w:r>
-              <w:t xml:space="preserve">Avg. late win pct</w:t>
-            </w:r>
-          </w:p>
-        </w:tc>
-        <w:tc>
-          <w:tcPr/>
-          <w:p>
-            <w:pPr>
-              <w:pStyle w:val="Compact"/>
-              <w:jc w:val="right"/>
-            </w:pPr>
-            <w:r>
-              <w:t xml:space="preserve">Avg. win pct change</w:t>
-            </w:r>
-          </w:p>
-        </w:tc>
-        <w:tc>
-          <w:tcPr/>
-          <w:p>
-            <w:pPr>
-              <w:pStyle w:val="Compact"/>
-              <w:jc w:val="right"/>
-            </w:pPr>
-            <w:r>
-              <w:t xml:space="preserve">Avg. tanking index</w:t>
-            </w:r>
-          </w:p>
-        </w:tc>
-        <w:tc>
-          <w:tcPr/>
-          <w:p>
-            <w:pPr>
-              <w:pStyle w:val="Compact"/>
-              <w:jc w:val="right"/>
-            </w:pPr>
-            <w:r>
-              <w:t xml:space="preserve">Tanking-proxy seasons</w:t>
-            </w:r>
-          </w:p>
-        </w:tc>
-        <w:tc>
-          <w:tcPr/>
-          <w:p>
-            <w:pPr>
-              <w:pStyle w:val="Compact"/>
-              <w:jc w:val="right"/>
-            </w:pPr>
-            <w:r>
-              <w:t xml:space="preserve">Lower-left candidate seasons</w:t>
+              <w:t xml:space="preserve">Era</w:t>
+            </w:r>
+          </w:p>
+        </w:tc>
+        <w:tc>
+          <w:tcPr/>
+          <w:p>
+            <w:pPr>
+              <w:pStyle w:val="Compact"/>
+              <w:jc w:val="left"/>
+            </w:pPr>
+            <w:r>
+              <w:t xml:space="preserve">Group</w:t>
+            </w:r>
+          </w:p>
+        </w:tc>
+        <w:tc>
+          <w:tcPr/>
+          <w:p>
+            <w:pPr>
+              <w:pStyle w:val="Compact"/>
+              <w:jc w:val="right"/>
+            </w:pPr>
+            <w:r>
+              <w:t xml:space="preserve">N</w:t>
+            </w:r>
+          </w:p>
+        </w:tc>
+        <w:tc>
+          <w:tcPr/>
+          <w:p>
+            <w:pPr>
+              <w:pStyle w:val="Compact"/>
+              <w:jc w:val="right"/>
+            </w:pPr>
+            <w:r>
+              <w:t xml:space="preserve">Pre win pct</w:t>
+            </w:r>
+          </w:p>
+        </w:tc>
+        <w:tc>
+          <w:tcPr/>
+          <w:p>
+            <w:pPr>
+              <w:pStyle w:val="Compact"/>
+              <w:jc w:val="right"/>
+            </w:pPr>
+            <w:r>
+              <w:t xml:space="preserve">Late win pct</w:t>
+            </w:r>
+          </w:p>
+        </w:tc>
+        <w:tc>
+          <w:tcPr/>
+          <w:p>
+            <w:pPr>
+              <w:pStyle w:val="Compact"/>
+              <w:jc w:val="right"/>
+            </w:pPr>
+            <w:r>
+              <w:t xml:space="preserve">Tanking index</w:t>
+            </w:r>
+          </w:p>
+        </w:tc>
+        <w:tc>
+          <w:tcPr/>
+          <w:p>
+            <w:pPr>
+              <w:pStyle w:val="Compact"/>
+              <w:jc w:val="right"/>
+            </w:pPr>
+            <w:r>
+              <w:t xml:space="preserve">Late-collapse rate</w:t>
+            </w:r>
+          </w:p>
+        </w:tc>
+        <w:tc>
+          <w:tcPr/>
+          <w:p>
+            <w:pPr>
+              <w:pStyle w:val="Compact"/>
+              <w:jc w:val="right"/>
+            </w:pPr>
+            <w:r>
+              <w:t xml:space="preserve">Low-win signal rate</w:t>
             </w:r>
           </w:p>
         </w:tc>
@@ -433,6 +564,18 @@
               <w:jc w:val="left"/>
             </w:pPr>
             <w:r>
+              <w:t xml:space="preserve">Post-reform (2019-2026)</w:t>
+            </w:r>
+          </w:p>
+        </w:tc>
+        <w:tc>
+          <w:tcPr/>
+          <w:p>
+            <w:pPr>
+              <w:pStyle w:val="Compact"/>
+              <w:jc w:val="left"/>
+            </w:pPr>
+            <w:r>
               <w:t xml:space="preserve">Likely lottery candidates</w:t>
             </w:r>
           </w:p>
@@ -445,79 +588,67 @@
               <w:jc w:val="right"/>
             </w:pPr>
             <w:r>
-              <w:t xml:space="preserve">65</w:t>
-            </w:r>
-          </w:p>
-        </w:tc>
-        <w:tc>
-          <w:tcPr/>
-          <w:p>
-            <w:pPr>
-              <w:pStyle w:val="Compact"/>
-              <w:jc w:val="right"/>
-            </w:pPr>
-            <w:r>
-              <w:t xml:space="preserve">0.313</w:t>
-            </w:r>
-          </w:p>
-        </w:tc>
-        <w:tc>
-          <w:tcPr/>
-          <w:p>
-            <w:pPr>
-              <w:pStyle w:val="Compact"/>
-              <w:jc w:val="right"/>
-            </w:pPr>
-            <w:r>
-              <w:t xml:space="preserve">0.306</w:t>
-            </w:r>
-          </w:p>
-        </w:tc>
-        <w:tc>
-          <w:tcPr/>
-          <w:p>
-            <w:pPr>
-              <w:pStyle w:val="Compact"/>
-              <w:jc w:val="right"/>
-            </w:pPr>
-            <w:r>
-              <w:t xml:space="preserve">-0.007</w:t>
-            </w:r>
-          </w:p>
-        </w:tc>
-        <w:tc>
-          <w:tcPr/>
-          <w:p>
-            <w:pPr>
-              <w:pStyle w:val="Compact"/>
-              <w:jc w:val="right"/>
-            </w:pPr>
-            <w:r>
-              <w:t xml:space="preserve">0.074</w:t>
-            </w:r>
-          </w:p>
-        </w:tc>
-        <w:tc>
-          <w:tcPr/>
-          <w:p>
-            <w:pPr>
-              <w:pStyle w:val="Compact"/>
-              <w:jc w:val="right"/>
-            </w:pPr>
-            <w:r>
-              <w:t xml:space="preserve">10</w:t>
-            </w:r>
-          </w:p>
-        </w:tc>
-        <w:tc>
-          <w:tcPr/>
-          <w:p>
-            <w:pPr>
-              <w:pStyle w:val="Compact"/>
-              <w:jc w:val="right"/>
-            </w:pPr>
-            <w:r>
-              <w:t xml:space="preserve">59</w:t>
+              <w:t xml:space="preserve">73</w:t>
+            </w:r>
+          </w:p>
+        </w:tc>
+        <w:tc>
+          <w:tcPr/>
+          <w:p>
+            <w:pPr>
+              <w:pStyle w:val="Compact"/>
+              <w:jc w:val="right"/>
+            </w:pPr>
+            <w:r>
+              <w:t xml:space="preserve">0.325</w:t>
+            </w:r>
+          </w:p>
+        </w:tc>
+        <w:tc>
+          <w:tcPr/>
+          <w:p>
+            <w:pPr>
+              <w:pStyle w:val="Compact"/>
+              <w:jc w:val="right"/>
+            </w:pPr>
+            <w:r>
+              <w:t xml:space="preserve">0.323</w:t>
+            </w:r>
+          </w:p>
+        </w:tc>
+        <w:tc>
+          <w:tcPr/>
+          <w:p>
+            <w:pPr>
+              <w:pStyle w:val="Compact"/>
+              <w:jc w:val="right"/>
+            </w:pPr>
+            <w:r>
+              <w:t xml:space="preserve">0.039</w:t>
+            </w:r>
+          </w:p>
+        </w:tc>
+        <w:tc>
+          <w:tcPr/>
+          <w:p>
+            <w:pPr>
+              <w:pStyle w:val="Compact"/>
+              <w:jc w:val="right"/>
+            </w:pPr>
+            <w:r>
+              <w:t xml:space="preserve">0.137</w:t>
+            </w:r>
+          </w:p>
+        </w:tc>
+        <w:tc>
+          <w:tcPr/>
+          <w:p>
+            <w:pPr>
+              <w:pStyle w:val="Compact"/>
+              <w:jc w:val="right"/>
+            </w:pPr>
+            <w:r>
+              <w:t xml:space="preserve">0.877</w:t>
             </w:r>
           </w:p>
         </w:tc>
@@ -531,6 +662,18 @@
               <w:jc w:val="left"/>
             </w:pPr>
             <w:r>
+              <w:t xml:space="preserve">Post-reform (2019-2026)</w:t>
+            </w:r>
+          </w:p>
+        </w:tc>
+        <w:tc>
+          <w:tcPr/>
+          <w:p>
+            <w:pPr>
+              <w:pStyle w:val="Compact"/>
+              <w:jc w:val="left"/>
+            </w:pPr>
+            <w:r>
               <w:t xml:space="preserve">Other teams</w:t>
             </w:r>
           </w:p>
@@ -543,31 +686,43 @@
               <w:jc w:val="right"/>
             </w:pPr>
             <w:r>
-              <w:t xml:space="preserve">175</w:t>
-            </w:r>
-          </w:p>
-        </w:tc>
-        <w:tc>
-          <w:tcPr/>
-          <w:p>
-            <w:pPr>
-              <w:pStyle w:val="Compact"/>
-              <w:jc w:val="right"/>
-            </w:pPr>
-            <w:r>
-              <w:t xml:space="preserve">0.569</w:t>
-            </w:r>
-          </w:p>
-        </w:tc>
-        <w:tc>
-          <w:tcPr/>
-          <w:p>
-            <w:pPr>
-              <w:pStyle w:val="Compact"/>
-              <w:jc w:val="right"/>
-            </w:pPr>
-            <w:r>
-              <w:t xml:space="preserve">0.569</w:t>
+              <w:t xml:space="preserve">167</w:t>
+            </w:r>
+          </w:p>
+        </w:tc>
+        <w:tc>
+          <w:tcPr/>
+          <w:p>
+            <w:pPr>
+              <w:pStyle w:val="Compact"/>
+              <w:jc w:val="right"/>
+            </w:pPr>
+            <w:r>
+              <w:t xml:space="preserve">0.577</w:t>
+            </w:r>
+          </w:p>
+        </w:tc>
+        <w:tc>
+          <w:tcPr/>
+          <w:p>
+            <w:pPr>
+              <w:pStyle w:val="Compact"/>
+              <w:jc w:val="right"/>
+            </w:pPr>
+            <w:r>
+              <w:t xml:space="preserve">0.574</w:t>
+            </w:r>
+          </w:p>
+        </w:tc>
+        <w:tc>
+          <w:tcPr/>
+          <w:p>
+            <w:pPr>
+              <w:pStyle w:val="Compact"/>
+              <w:jc w:val="right"/>
+            </w:pPr>
+            <w:r>
+              <w:t xml:space="preserve">0.028</w:t>
             </w:r>
           </w:p>
         </w:tc>
@@ -591,36 +746,216 @@
               <w:jc w:val="right"/>
             </w:pPr>
             <w:r>
-              <w:t xml:space="preserve">0.015</w:t>
-            </w:r>
-          </w:p>
-        </w:tc>
-        <w:tc>
-          <w:tcPr/>
-          <w:p>
-            <w:pPr>
-              <w:pStyle w:val="Compact"/>
-              <w:jc w:val="right"/>
-            </w:pPr>
-            <w:r>
-              <w:t xml:space="preserve">0</w:t>
-            </w:r>
-          </w:p>
-        </w:tc>
-        <w:tc>
-          <w:tcPr/>
-          <w:p>
-            <w:pPr>
-              <w:pStyle w:val="Compact"/>
-              <w:jc w:val="right"/>
-            </w:pPr>
-            <w:r>
-              <w:t xml:space="preserve">0</w:t>
+              <w:t xml:space="preserve">0.000</w:t>
+            </w:r>
+          </w:p>
+        </w:tc>
+      </w:tr>
+      <w:tr>
+        <w:tc>
+          <w:tcPr/>
+          <w:p>
+            <w:pPr>
+              <w:pStyle w:val="Compact"/>
+              <w:jc w:val="left"/>
+            </w:pPr>
+            <w:r>
+              <w:t xml:space="preserve">Pre-reform (2010-2018)</w:t>
+            </w:r>
+          </w:p>
+        </w:tc>
+        <w:tc>
+          <w:tcPr/>
+          <w:p>
+            <w:pPr>
+              <w:pStyle w:val="Compact"/>
+              <w:jc w:val="left"/>
+            </w:pPr>
+            <w:r>
+              <w:t xml:space="preserve">Likely lottery candidates</w:t>
+            </w:r>
+          </w:p>
+        </w:tc>
+        <w:tc>
+          <w:tcPr/>
+          <w:p>
+            <w:pPr>
+              <w:pStyle w:val="Compact"/>
+              <w:jc w:val="right"/>
+            </w:pPr>
+            <w:r>
+              <w:t xml:space="preserve">102</w:t>
+            </w:r>
+          </w:p>
+        </w:tc>
+        <w:tc>
+          <w:tcPr/>
+          <w:p>
+            <w:pPr>
+              <w:pStyle w:val="Compact"/>
+              <w:jc w:val="right"/>
+            </w:pPr>
+            <w:r>
+              <w:t xml:space="preserve">0.340</w:t>
+            </w:r>
+          </w:p>
+        </w:tc>
+        <w:tc>
+          <w:tcPr/>
+          <w:p>
+            <w:pPr>
+              <w:pStyle w:val="Compact"/>
+              <w:jc w:val="right"/>
+            </w:pPr>
+            <w:r>
+              <w:t xml:space="preserve">0.338</w:t>
+            </w:r>
+          </w:p>
+        </w:tc>
+        <w:tc>
+          <w:tcPr/>
+          <w:p>
+            <w:pPr>
+              <w:pStyle w:val="Compact"/>
+              <w:jc w:val="right"/>
+            </w:pPr>
+            <w:r>
+              <w:t xml:space="preserve">-0.022</w:t>
+            </w:r>
+          </w:p>
+        </w:tc>
+        <w:tc>
+          <w:tcPr/>
+          <w:p>
+            <w:pPr>
+              <w:pStyle w:val="Compact"/>
+              <w:jc w:val="right"/>
+            </w:pPr>
+            <w:r>
+              <w:t xml:space="preserve">0.108</w:t>
+            </w:r>
+          </w:p>
+        </w:tc>
+        <w:tc>
+          <w:tcPr/>
+          <w:p>
+            <w:pPr>
+              <w:pStyle w:val="Compact"/>
+              <w:jc w:val="right"/>
+            </w:pPr>
+            <w:r>
+              <w:t xml:space="preserve">0.873</w:t>
+            </w:r>
+          </w:p>
+        </w:tc>
+      </w:tr>
+      <w:tr>
+        <w:tc>
+          <w:tcPr/>
+          <w:p>
+            <w:pPr>
+              <w:pStyle w:val="Compact"/>
+              <w:jc w:val="left"/>
+            </w:pPr>
+            <w:r>
+              <w:t xml:space="preserve">Pre-reform (2010-2018)</w:t>
+            </w:r>
+          </w:p>
+        </w:tc>
+        <w:tc>
+          <w:tcPr/>
+          <w:p>
+            <w:pPr>
+              <w:pStyle w:val="Compact"/>
+              <w:jc w:val="left"/>
+            </w:pPr>
+            <w:r>
+              <w:t xml:space="preserve">Other teams</w:t>
+            </w:r>
+          </w:p>
+        </w:tc>
+        <w:tc>
+          <w:tcPr/>
+          <w:p>
+            <w:pPr>
+              <w:pStyle w:val="Compact"/>
+              <w:jc w:val="right"/>
+            </w:pPr>
+            <w:r>
+              <w:t xml:space="preserve">168</w:t>
+            </w:r>
+          </w:p>
+        </w:tc>
+        <w:tc>
+          <w:tcPr/>
+          <w:p>
+            <w:pPr>
+              <w:pStyle w:val="Compact"/>
+              <w:jc w:val="right"/>
+            </w:pPr>
+            <w:r>
+              <w:t xml:space="preserve">0.597</w:t>
+            </w:r>
+          </w:p>
+        </w:tc>
+        <w:tc>
+          <w:tcPr/>
+          <w:p>
+            <w:pPr>
+              <w:pStyle w:val="Compact"/>
+              <w:jc w:val="right"/>
+            </w:pPr>
+            <w:r>
+              <w:t xml:space="preserve">0.598</w:t>
+            </w:r>
+          </w:p>
+        </w:tc>
+        <w:tc>
+          <w:tcPr/>
+          <w:p>
+            <w:pPr>
+              <w:pStyle w:val="Compact"/>
+              <w:jc w:val="right"/>
+            </w:pPr>
+            <w:r>
+              <w:t xml:space="preserve">0.039</w:t>
+            </w:r>
+          </w:p>
+        </w:tc>
+        <w:tc>
+          <w:tcPr/>
+          <w:p>
+            <w:pPr>
+              <w:pStyle w:val="Compact"/>
+              <w:jc w:val="right"/>
+            </w:pPr>
+            <w:r>
+              <w:t xml:space="preserve">0.000</w:t>
+            </w:r>
+          </w:p>
+        </w:tc>
+        <w:tc>
+          <w:tcPr/>
+          <w:p>
+            <w:pPr>
+              <w:pStyle w:val="Compact"/>
+              <w:jc w:val="right"/>
+            </w:pPr>
+            <w:r>
+              <w:t xml:space="preserve">0.000</w:t>
             </w:r>
           </w:p>
         </w:tc>
       </w:tr>
     </w:tbl>
+    <w:p>
+      <w:pPr>
+        <w:pStyle w:val="BodyText"/>
+      </w:pPr>
+      <w:r>
+        <w:t xml:space="preserve">Table 1 shows that likely lottery candidates are much weaker than other teams before March, as expected. The average win percentage change from pre-March to late season is small in both eras, which suggests that most weak teams do not suddenly collapse late in the year. The conservative late-collapse proxy appears in only 21 of 175 likely-candidate seasons, so our binary proxy is intentionally strict. The sustained low-win signal is much more common because many likely lottery teams are bad before March and remain bad afterward.</w:t>
+      </w:r>
+    </w:p>
     <w:p>
       <w:pPr>
         <w:pStyle w:val="CaptionedFigure"/>
@@ -630,18 +965,18 @@
           <wp:inline>
             <wp:extent cx="5334000" cy="3333750"/>
             <wp:effectExtent b="0" l="0" r="0" t="0"/>
-            <wp:docPr descr="Late-season performance compared with pre-March performance." title="" id="23" name="Picture"/>
+            <wp:docPr descr="Figure 1. Late-season performance compared with pre-March performance. Each point is one team-season from 2010 through 2026. The dashed line shows equal pre-March and March-onward win percentages. Triangles are likely lottery candidates. Red points are conservative late-collapse proxy seasons, orange points are sustained low-win signal seasons, and blue points are all other team-seasons. Labels identify the largest late-collapse proxy seasons." title="" id="28" name="Picture"/>
             <a:graphic>
               <a:graphicData uri="http://schemas.openxmlformats.org/drawingml/2006/picture">
                 <pic:pic>
                   <pic:nvPicPr>
-                    <pic:cNvPr descr="project-report_files/figure-docx/visual-expected-vs-actual-1.png" id="24" name="Picture"/>
+                    <pic:cNvPr descr="project-report_files/figure-docx/visual-expected-vs-actual-1.png" id="29" name="Picture"/>
                     <pic:cNvPicPr>
                       <a:picLocks noChangeArrowheads="1" noChangeAspect="1"/>
                     </pic:cNvPicPr>
                   </pic:nvPicPr>
                   <pic:blipFill>
-                    <a:blip r:embed="rId22"/>
+                    <a:blip r:embed="rId27"/>
                     <a:stretch>
                       <a:fillRect/>
                     </a:stretch>
@@ -673,7 +1008,7 @@
         <w:pStyle w:val="ImageCaption"/>
       </w:pPr>
       <w:r>
-        <w:t xml:space="preserve">Late-season performance compared with pre-March performance.</w:t>
+        <w:t xml:space="preserve">Figure 1. Late-season performance compared with pre-March performance. Each point is one team-season from 2010 through 2026. The dashed line shows equal pre-March and March-onward win percentages. Triangles are likely lottery candidates. Red points are conservative late-collapse proxy seasons, orange points are sustained low-win signal seasons, and blue points are all other team-seasons. Labels identify the largest late-collapse proxy seasons.</w:t>
       </w:r>
     </w:p>
     <w:p>
@@ -681,7 +1016,7 @@
         <w:pStyle w:val="BodyText"/>
       </w:pPr>
       <w:r>
-        <w:t xml:space="preserve">The visualization compares teams pre march win percentage with their win percentage after march. The graph classifies teams that are likely lottery candidates, meaning they are prime examples of teams that would choose to tank in the latter part of the season. This is done based on win percentage or games-behind playoff contention. Also, the visual separates teams that were bad the whole year vs. ones who were bad and then continued to be worse late in the season. This is done because we want the model to only consider the late season collapses when determining whether a team decided to tank.</w:t>
+        <w:t xml:space="preserve">Figure 1 shows that most teams cluster near the diagonal, meaning their late-season winning percentage was similar to their pre-March winning percentage. The likely lottery candidates mostly appear in the lower-left portion of the graph, which confirms that the candidate definition is identifying weaker teams. The red points are rarer and more extreme: they are teams that were not only bad, but substantially worse late in the season than their earlier record would predict. The orange points address an important weakness of the original binary proxy: some teams do not sharply collapse because they were already near the bottom, but their continued low-win performance may still be relevant to tanking incentives.</w:t>
       </w:r>
     </w:p>
     <w:p>
@@ -693,18 +1028,18 @@
           <wp:inline>
             <wp:extent cx="5334000" cy="3333750"/>
             <wp:effectExtent b="0" l="0" r="0" t="0"/>
-            <wp:docPr descr="Draft strength and average late-season underperformance among likely lottery teams." title="" id="26" name="Picture"/>
+            <wp:docPr descr="Figure 2. Draft strength and average late-season underperformance among likely lottery candidates. Each point is one NBA season. The x-axis is the CraftedNBA average draft class rating, the y-axis is the mean tanking index among likely lottery candidates, and point size is the number of conservative late-collapse proxy team-seasons in that year. Fitted lines are descriptive and are shown separately for the pre-reform and post-reform lottery eras." title="" id="31" name="Picture"/>
             <a:graphic>
               <a:graphicData uri="http://schemas.openxmlformats.org/drawingml/2006/picture">
                 <pic:pic>
                   <pic:nvPicPr>
-                    <pic:cNvPr descr="project-report_files/figure-docx/visual-draft-strength-1.png" id="27" name="Picture"/>
+                    <pic:cNvPr descr="project-report_files/figure-docx/visual-draft-strength-1.png" id="32" name="Picture"/>
                     <pic:cNvPicPr>
                       <a:picLocks noChangeArrowheads="1" noChangeAspect="1"/>
                     </pic:cNvPicPr>
                   </pic:nvPicPr>
                   <pic:blipFill>
-                    <a:blip r:embed="rId25"/>
+                    <a:blip r:embed="rId30"/>
                     <a:stretch>
                       <a:fillRect/>
                     </a:stretch>
@@ -736,7 +1071,7 @@
         <w:pStyle w:val="ImageCaption"/>
       </w:pPr>
       <w:r>
-        <w:t xml:space="preserve">Draft strength and average late-season underperformance among likely lottery teams.</w:t>
+        <w:t xml:space="preserve">Figure 2. Draft strength and average late-season underperformance among likely lottery candidates. Each point is one NBA season. The x-axis is the CraftedNBA average draft class rating, the y-axis is the mean tanking index among likely lottery candidates, and point size is the number of conservative late-collapse proxy team-seasons in that year. Fitted lines are descriptive and are shown separately for the pre-reform and post-reform lottery eras.</w:t>
       </w:r>
     </w:p>
     <w:p>
@@ -744,18 +1079,17 @@
         <w:pStyle w:val="BodyText"/>
       </w:pPr>
       <w:r>
-        <w:t xml:space="preserve">This graph shows whether our core research question can be answered by the data. The relationship of the draft class rating to the tanking index is positive as we expected, especially considering the amazing draft class of 2026. We also notice an outlier—2021—and will deal with that later (by either controlling for it or removing it).</w:t>
-      </w:r>
-    </w:p>
-    <w:bookmarkEnd w:id="28"/>
-    <w:bookmarkEnd w:id="29"/>
-    <w:bookmarkStart w:id="30" w:name="plan-moving-forward"/>
+        <w:t xml:space="preserve">Figure 2 suggests a different pattern before and after the lottery reform. In the pre-reform seasons, the relationship between draft strength and average tanking index is weak and slightly negative. In the post-reform seasons, the relationship is positive, mainly because the stronger recent draft classes in 2025 and 2026 coincide with higher average late-season underperformance among likely lottery candidates. However, the figure also shows why the conclusion should be cautious: there are only 17 season-level draft class observations, and 2021 remains unusual because it was affected by COVID-era scheduling and roster disruptions.</w:t>
+      </w:r>
+    </w:p>
+    <w:bookmarkEnd w:id="33"/>
+    <w:bookmarkStart w:id="34" w:name="modeling-results"/>
     <w:p>
       <w:pPr>
         <w:pStyle w:val="Heading2"/>
       </w:pPr>
       <w:r>
-        <w:t xml:space="preserve">Plan Moving Forward</w:t>
+        <w:t xml:space="preserve">Modeling Results</w:t>
       </w:r>
     </w:p>
     <w:p>
@@ -763,17 +1097,904 @@
         <w:pStyle w:val="FirstParagraph"/>
       </w:pPr>
       <w:r>
-        <w:t xml:space="preserve">The NBA flattened the probabilities of teams getting lottery picks in 2019, including the team with the worst overall record dropping from a 25% chance of being selected for the top overall pick to only 14%, so our plan moving forward is to extend our observations of draft classes and teams tanking to include 2010-2018. Furthermore, we are going to run sensitivity checks on the cutoff date of March 1st. The NBA All-Star break is in mid-February, so we will see if there is a change in the effect based on the cutoff date we choose. Currently, the model depends on some arbitrary cutoffs (.400 win proportion before March, being at least 3 games behind the 10th seed), but we should test other definitions of being out of contention. One thing we can do is add games_behind_10 directly into the model, change the threshold around, and estimate a rough play-in probability going into March. Something else we are talking about adding are variables to distinguish tanking from other reasons why a team may perform poorly at the end of a season (injuries/fatigue, harder schedule), which would include adding in player injuries, remaining strength of schedule, and/or changes from the trade deadline. We want to build a model comparing the 2019-2026 data to 2010-2018 and conclude whether or not there was a difference in how incentivized teams have been to tank. A final idea that we are currently looking through is whether or not a linear model even makes sense given the data - there appears to be some curvature in the 2019-2026 data.</w:t>
-      </w:r>
-    </w:p>
-    <w:bookmarkEnd w:id="30"/>
-    <w:bookmarkStart w:id="31" w:name="anticipated-challenges"/>
+        <w:t xml:space="preserve">Our main model is limited to likely lottery candidates because those are the teams with the clearest incentive to lose late-season games. The model predicts</w:t>
+      </w:r>
+      <w:r>
+        <w:t xml:space="preserve"> </w:t>
+      </w:r>
+      <w:r>
+        <w:rPr>
+          <w:rStyle w:val="VerbatimChar"/>
+        </w:rPr>
+        <w:t xml:space="preserve">tanking_index</w:t>
+      </w:r>
+      <w:r>
+        <w:t xml:space="preserve"> </w:t>
+      </w:r>
+      <w:r>
+        <w:t xml:space="preserve">using draft class rating, lottery era, their interaction, games behind the postseason cutline, pre-March win percentage, and a disrupted-season indicator.</w:t>
+      </w:r>
+    </w:p>
+    <w:p>
+      <w:pPr>
+        <w:pStyle w:val="BodyText"/>
+      </w:pPr>
+      <w:r>
+        <w:t xml:space="preserve">The interaction term is the key test. It asks whether the relationship between draft class strength and late-season underperformance changed after the lottery reform.</w:t>
+      </w:r>
+    </w:p>
+    <w:p>
+      <w:pPr>
+        <w:pStyle w:val="TableCaption"/>
+      </w:pPr>
+      <w:r>
+        <w:t xml:space="preserve">Table 2. Regression models among likely lottery candidates.</w:t>
+      </w:r>
+    </w:p>
+    <w:tbl>
+      <w:tblPr>
+        <w:tblStyle w:val="Table"/>
+        <w:tblW w:type="pct" w:w="5000"/>
+        <w:tblLayout w:type="fixed"/>
+        <w:tblLook w:firstRow="1" w:lastRow="0" w:firstColumn="0" w:lastColumn="0" w:noHBand="0" w:noVBand="0" w:val="0020"/>
+        <w:tblCaption w:val="Table 2. Regression models among likely lottery candidates."/>
+      </w:tblPr>
+      <w:tblGrid>
+        <w:gridCol w:w="2006"/>
+        <w:gridCol w:w="2956"/>
+        <w:gridCol w:w="950"/>
+        <w:gridCol w:w="1161"/>
+        <w:gridCol w:w="844"/>
+      </w:tblGrid>
+      <w:tr>
+        <w:trPr>
+          <w:tblHeader w:val="on"/>
+        </w:trPr>
+        <w:tc>
+          <w:tcPr/>
+          <w:p>
+            <w:pPr>
+              <w:pStyle w:val="Compact"/>
+              <w:jc w:val="left"/>
+            </w:pPr>
+            <w:r>
+              <w:t xml:space="preserve">Model</w:t>
+            </w:r>
+          </w:p>
+        </w:tc>
+        <w:tc>
+          <w:tcPr/>
+          <w:p>
+            <w:pPr>
+              <w:pStyle w:val="Compact"/>
+              <w:jc w:val="left"/>
+            </w:pPr>
+            <w:r>
+              <w:t xml:space="preserve">Term</w:t>
+            </w:r>
+          </w:p>
+        </w:tc>
+        <w:tc>
+          <w:tcPr/>
+          <w:p>
+            <w:pPr>
+              <w:pStyle w:val="Compact"/>
+              <w:jc w:val="right"/>
+            </w:pPr>
+            <w:r>
+              <w:t xml:space="preserve">Estimate</w:t>
+            </w:r>
+          </w:p>
+        </w:tc>
+        <w:tc>
+          <w:tcPr/>
+          <w:p>
+            <w:pPr>
+              <w:pStyle w:val="Compact"/>
+              <w:jc w:val="right"/>
+            </w:pPr>
+            <w:r>
+              <w:t xml:space="preserve">Std. error</w:t>
+            </w:r>
+          </w:p>
+        </w:tc>
+        <w:tc>
+          <w:tcPr/>
+          <w:p>
+            <w:pPr>
+              <w:pStyle w:val="Compact"/>
+              <w:jc w:val="right"/>
+            </w:pPr>
+            <w:r>
+              <w:t xml:space="preserve">p-value</w:t>
+            </w:r>
+          </w:p>
+        </w:tc>
+      </w:tr>
+      <w:tr>
+        <w:tc>
+          <w:tcPr/>
+          <w:p>
+            <w:pPr>
+              <w:pStyle w:val="Compact"/>
+              <w:jc w:val="left"/>
+            </w:pPr>
+            <w:r>
+              <w:t xml:space="preserve">Tanking index</w:t>
+            </w:r>
+          </w:p>
+        </w:tc>
+        <w:tc>
+          <w:tcPr/>
+          <w:p>
+            <w:pPr>
+              <w:pStyle w:val="Compact"/>
+              <w:jc w:val="left"/>
+            </w:pPr>
+            <w:r>
+              <w:t xml:space="preserve">Draft rating (standardized)</w:t>
+            </w:r>
+          </w:p>
+        </w:tc>
+        <w:tc>
+          <w:tcPr/>
+          <w:p>
+            <w:pPr>
+              <w:pStyle w:val="Compact"/>
+              <w:jc w:val="right"/>
+            </w:pPr>
+            <w:r>
+              <w:t xml:space="preserve">-0.127</w:t>
+            </w:r>
+          </w:p>
+        </w:tc>
+        <w:tc>
+          <w:tcPr/>
+          <w:p>
+            <w:pPr>
+              <w:pStyle w:val="Compact"/>
+              <w:jc w:val="right"/>
+            </w:pPr>
+            <w:r>
+              <w:t xml:space="preserve">0.319</w:t>
+            </w:r>
+          </w:p>
+        </w:tc>
+        <w:tc>
+          <w:tcPr/>
+          <w:p>
+            <w:pPr>
+              <w:pStyle w:val="Compact"/>
+              <w:jc w:val="right"/>
+            </w:pPr>
+            <w:r>
+              <w:t xml:space="preserve">0.690</w:t>
+            </w:r>
+          </w:p>
+        </w:tc>
+      </w:tr>
+      <w:tr>
+        <w:tc>
+          <w:tcPr/>
+          <w:p>
+            <w:pPr>
+              <w:pStyle w:val="Compact"/>
+              <w:jc w:val="left"/>
+            </w:pPr>
+            <w:r>
+              <w:t xml:space="preserve">Tanking index</w:t>
+            </w:r>
+          </w:p>
+        </w:tc>
+        <w:tc>
+          <w:tcPr/>
+          <w:p>
+            <w:pPr>
+              <w:pStyle w:val="Compact"/>
+              <w:jc w:val="left"/>
+            </w:pPr>
+            <w:r>
+              <w:t xml:space="preserve">Post-reform era</w:t>
+            </w:r>
+          </w:p>
+        </w:tc>
+        <w:tc>
+          <w:tcPr/>
+          <w:p>
+            <w:pPr>
+              <w:pStyle w:val="Compact"/>
+              <w:jc w:val="right"/>
+            </w:pPr>
+            <w:r>
+              <w:t xml:space="preserve">0.205</w:t>
+            </w:r>
+          </w:p>
+        </w:tc>
+        <w:tc>
+          <w:tcPr/>
+          <w:p>
+            <w:pPr>
+              <w:pStyle w:val="Compact"/>
+              <w:jc w:val="right"/>
+            </w:pPr>
+            <w:r>
+              <w:t xml:space="preserve">0.210</w:t>
+            </w:r>
+          </w:p>
+        </w:tc>
+        <w:tc>
+          <w:tcPr/>
+          <w:p>
+            <w:pPr>
+              <w:pStyle w:val="Compact"/>
+              <w:jc w:val="right"/>
+            </w:pPr>
+            <w:r>
+              <w:t xml:space="preserve">0.329</w:t>
+            </w:r>
+          </w:p>
+        </w:tc>
+      </w:tr>
+      <w:tr>
+        <w:tc>
+          <w:tcPr/>
+          <w:p>
+            <w:pPr>
+              <w:pStyle w:val="Compact"/>
+              <w:jc w:val="left"/>
+            </w:pPr>
+            <w:r>
+              <w:t xml:space="preserve">Tanking index</w:t>
+            </w:r>
+          </w:p>
+        </w:tc>
+        <w:tc>
+          <w:tcPr/>
+          <w:p>
+            <w:pPr>
+              <w:pStyle w:val="Compact"/>
+              <w:jc w:val="left"/>
+            </w:pPr>
+            <w:r>
+              <w:t xml:space="preserve">Games behind cutoff</w:t>
+            </w:r>
+          </w:p>
+        </w:tc>
+        <w:tc>
+          <w:tcPr/>
+          <w:p>
+            <w:pPr>
+              <w:pStyle w:val="Compact"/>
+              <w:jc w:val="right"/>
+            </w:pPr>
+            <w:r>
+              <w:t xml:space="preserve">0.012</w:t>
+            </w:r>
+          </w:p>
+        </w:tc>
+        <w:tc>
+          <w:tcPr/>
+          <w:p>
+            <w:pPr>
+              <w:pStyle w:val="Compact"/>
+              <w:jc w:val="right"/>
+            </w:pPr>
+            <w:r>
+              <w:t xml:space="preserve">0.041</w:t>
+            </w:r>
+          </w:p>
+        </w:tc>
+        <w:tc>
+          <w:tcPr/>
+          <w:p>
+            <w:pPr>
+              <w:pStyle w:val="Compact"/>
+              <w:jc w:val="right"/>
+            </w:pPr>
+            <w:r>
+              <w:t xml:space="preserve">0.776</w:t>
+            </w:r>
+          </w:p>
+        </w:tc>
+      </w:tr>
+      <w:tr>
+        <w:tc>
+          <w:tcPr/>
+          <w:p>
+            <w:pPr>
+              <w:pStyle w:val="Compact"/>
+              <w:jc w:val="left"/>
+            </w:pPr>
+            <w:r>
+              <w:t xml:space="preserve">Tanking index</w:t>
+            </w:r>
+          </w:p>
+        </w:tc>
+        <w:tc>
+          <w:tcPr/>
+          <w:p>
+            <w:pPr>
+              <w:pStyle w:val="Compact"/>
+              <w:jc w:val="left"/>
+            </w:pPr>
+            <w:r>
+              <w:t xml:space="preserve">Pre-March win pct</w:t>
+            </w:r>
+          </w:p>
+        </w:tc>
+        <w:tc>
+          <w:tcPr/>
+          <w:p>
+            <w:pPr>
+              <w:pStyle w:val="Compact"/>
+              <w:jc w:val="right"/>
+            </w:pPr>
+            <w:r>
+              <w:t xml:space="preserve">5.441</w:t>
+            </w:r>
+          </w:p>
+        </w:tc>
+        <w:tc>
+          <w:tcPr/>
+          <w:p>
+            <w:pPr>
+              <w:pStyle w:val="Compact"/>
+              <w:jc w:val="right"/>
+            </w:pPr>
+            <w:r>
+              <w:t xml:space="preserve">2.298</w:t>
+            </w:r>
+          </w:p>
+        </w:tc>
+        <w:tc>
+          <w:tcPr/>
+          <w:p>
+            <w:pPr>
+              <w:pStyle w:val="Compact"/>
+              <w:jc w:val="right"/>
+            </w:pPr>
+            <w:r>
+              <w:t xml:space="preserve">0.019</w:t>
+            </w:r>
+          </w:p>
+        </w:tc>
+      </w:tr>
+      <w:tr>
+        <w:tc>
+          <w:tcPr/>
+          <w:p>
+            <w:pPr>
+              <w:pStyle w:val="Compact"/>
+              <w:jc w:val="left"/>
+            </w:pPr>
+            <w:r>
+              <w:t xml:space="preserve">Tanking index</w:t>
+            </w:r>
+          </w:p>
+        </w:tc>
+        <w:tc>
+          <w:tcPr/>
+          <w:p>
+            <w:pPr>
+              <w:pStyle w:val="Compact"/>
+              <w:jc w:val="left"/>
+            </w:pPr>
+            <w:r>
+              <w:t xml:space="preserve">Disrupted season</w:t>
+            </w:r>
+          </w:p>
+        </w:tc>
+        <w:tc>
+          <w:tcPr/>
+          <w:p>
+            <w:pPr>
+              <w:pStyle w:val="Compact"/>
+              <w:jc w:val="right"/>
+            </w:pPr>
+            <w:r>
+              <w:t xml:space="preserve">-0.284</w:t>
+            </w:r>
+          </w:p>
+        </w:tc>
+        <w:tc>
+          <w:tcPr/>
+          <w:p>
+            <w:pPr>
+              <w:pStyle w:val="Compact"/>
+              <w:jc w:val="right"/>
+            </w:pPr>
+            <w:r>
+              <w:t xml:space="preserve">0.305</w:t>
+            </w:r>
+          </w:p>
+        </w:tc>
+        <w:tc>
+          <w:tcPr/>
+          <w:p>
+            <w:pPr>
+              <w:pStyle w:val="Compact"/>
+              <w:jc w:val="right"/>
+            </w:pPr>
+            <w:r>
+              <w:t xml:space="preserve">0.354</w:t>
+            </w:r>
+          </w:p>
+        </w:tc>
+      </w:tr>
+      <w:tr>
+        <w:tc>
+          <w:tcPr/>
+          <w:p>
+            <w:pPr>
+              <w:pStyle w:val="Compact"/>
+              <w:jc w:val="left"/>
+            </w:pPr>
+            <w:r>
+              <w:t xml:space="preserve">Tanking index</w:t>
+            </w:r>
+          </w:p>
+        </w:tc>
+        <w:tc>
+          <w:tcPr/>
+          <w:p>
+            <w:pPr>
+              <w:pStyle w:val="Compact"/>
+              <w:jc w:val="left"/>
+            </w:pPr>
+            <w:r>
+              <w:t xml:space="preserve">Draft rating x post-reform</w:t>
+            </w:r>
+          </w:p>
+        </w:tc>
+        <w:tc>
+          <w:tcPr/>
+          <w:p>
+            <w:pPr>
+              <w:pStyle w:val="Compact"/>
+              <w:jc w:val="right"/>
+            </w:pPr>
+            <w:r>
+              <w:t xml:space="preserve">0.316</w:t>
+            </w:r>
+          </w:p>
+        </w:tc>
+        <w:tc>
+          <w:tcPr/>
+          <w:p>
+            <w:pPr>
+              <w:pStyle w:val="Compact"/>
+              <w:jc w:val="right"/>
+            </w:pPr>
+            <w:r>
+              <w:t xml:space="preserve">0.338</w:t>
+            </w:r>
+          </w:p>
+        </w:tc>
+        <w:tc>
+          <w:tcPr/>
+          <w:p>
+            <w:pPr>
+              <w:pStyle w:val="Compact"/>
+              <w:jc w:val="right"/>
+            </w:pPr>
+            <w:r>
+              <w:t xml:space="preserve">0.351</w:t>
+            </w:r>
+          </w:p>
+        </w:tc>
+      </w:tr>
+      <w:tr>
+        <w:tc>
+          <w:tcPr/>
+          <w:p>
+            <w:pPr>
+              <w:pStyle w:val="Compact"/>
+              <w:jc w:val="left"/>
+            </w:pPr>
+            <w:r>
+              <w:t xml:space="preserve">Late low-win score</w:t>
+            </w:r>
+          </w:p>
+        </w:tc>
+        <w:tc>
+          <w:tcPr/>
+          <w:p>
+            <w:pPr>
+              <w:pStyle w:val="Compact"/>
+              <w:jc w:val="left"/>
+            </w:pPr>
+            <w:r>
+              <w:t xml:space="preserve">Draft rating (standardized)</w:t>
+            </w:r>
+          </w:p>
+        </w:tc>
+        <w:tc>
+          <w:tcPr/>
+          <w:p>
+            <w:pPr>
+              <w:pStyle w:val="Compact"/>
+              <w:jc w:val="right"/>
+            </w:pPr>
+            <w:r>
+              <w:t xml:space="preserve">-0.008</w:t>
+            </w:r>
+          </w:p>
+        </w:tc>
+        <w:tc>
+          <w:tcPr/>
+          <w:p>
+            <w:pPr>
+              <w:pStyle w:val="Compact"/>
+              <w:jc w:val="right"/>
+            </w:pPr>
+            <w:r>
+              <w:t xml:space="preserve">0.027</w:t>
+            </w:r>
+          </w:p>
+        </w:tc>
+        <w:tc>
+          <w:tcPr/>
+          <w:p>
+            <w:pPr>
+              <w:pStyle w:val="Compact"/>
+              <w:jc w:val="right"/>
+            </w:pPr>
+            <w:r>
+              <w:t xml:space="preserve">0.774</w:t>
+            </w:r>
+          </w:p>
+        </w:tc>
+      </w:tr>
+      <w:tr>
+        <w:tc>
+          <w:tcPr/>
+          <w:p>
+            <w:pPr>
+              <w:pStyle w:val="Compact"/>
+              <w:jc w:val="left"/>
+            </w:pPr>
+            <w:r>
+              <w:t xml:space="preserve">Late low-win score</w:t>
+            </w:r>
+          </w:p>
+        </w:tc>
+        <w:tc>
+          <w:tcPr/>
+          <w:p>
+            <w:pPr>
+              <w:pStyle w:val="Compact"/>
+              <w:jc w:val="left"/>
+            </w:pPr>
+            <w:r>
+              <w:t xml:space="preserve">Post-reform era</w:t>
+            </w:r>
+          </w:p>
+        </w:tc>
+        <w:tc>
+          <w:tcPr/>
+          <w:p>
+            <w:pPr>
+              <w:pStyle w:val="Compact"/>
+              <w:jc w:val="right"/>
+            </w:pPr>
+            <w:r>
+              <w:t xml:space="preserve">0.016</w:t>
+            </w:r>
+          </w:p>
+        </w:tc>
+        <w:tc>
+          <w:tcPr/>
+          <w:p>
+            <w:pPr>
+              <w:pStyle w:val="Compact"/>
+              <w:jc w:val="right"/>
+            </w:pPr>
+            <w:r>
+              <w:t xml:space="preserve">0.018</w:t>
+            </w:r>
+          </w:p>
+        </w:tc>
+        <w:tc>
+          <w:tcPr/>
+          <w:p>
+            <w:pPr>
+              <w:pStyle w:val="Compact"/>
+              <w:jc w:val="right"/>
+            </w:pPr>
+            <w:r>
+              <w:t xml:space="preserve">0.363</w:t>
+            </w:r>
+          </w:p>
+        </w:tc>
+      </w:tr>
+      <w:tr>
+        <w:tc>
+          <w:tcPr/>
+          <w:p>
+            <w:pPr>
+              <w:pStyle w:val="Compact"/>
+              <w:jc w:val="left"/>
+            </w:pPr>
+            <w:r>
+              <w:t xml:space="preserve">Late low-win score</w:t>
+            </w:r>
+          </w:p>
+        </w:tc>
+        <w:tc>
+          <w:tcPr/>
+          <w:p>
+            <w:pPr>
+              <w:pStyle w:val="Compact"/>
+              <w:jc w:val="left"/>
+            </w:pPr>
+            <w:r>
+              <w:t xml:space="preserve">Games behind cutoff</w:t>
+            </w:r>
+          </w:p>
+        </w:tc>
+        <w:tc>
+          <w:tcPr/>
+          <w:p>
+            <w:pPr>
+              <w:pStyle w:val="Compact"/>
+              <w:jc w:val="right"/>
+            </w:pPr>
+            <w:r>
+              <w:t xml:space="preserve">0.001</w:t>
+            </w:r>
+          </w:p>
+        </w:tc>
+        <w:tc>
+          <w:tcPr/>
+          <w:p>
+            <w:pPr>
+              <w:pStyle w:val="Compact"/>
+              <w:jc w:val="right"/>
+            </w:pPr>
+            <w:r>
+              <w:t xml:space="preserve">0.004</w:t>
+            </w:r>
+          </w:p>
+        </w:tc>
+        <w:tc>
+          <w:tcPr/>
+          <w:p>
+            <w:pPr>
+              <w:pStyle w:val="Compact"/>
+              <w:jc w:val="right"/>
+            </w:pPr>
+            <w:r>
+              <w:t xml:space="preserve">0.840</w:t>
+            </w:r>
+          </w:p>
+        </w:tc>
+      </w:tr>
+      <w:tr>
+        <w:tc>
+          <w:tcPr/>
+          <w:p>
+            <w:pPr>
+              <w:pStyle w:val="Compact"/>
+              <w:jc w:val="left"/>
+            </w:pPr>
+            <w:r>
+              <w:t xml:space="preserve">Late low-win score</w:t>
+            </w:r>
+          </w:p>
+        </w:tc>
+        <w:tc>
+          <w:tcPr/>
+          <w:p>
+            <w:pPr>
+              <w:pStyle w:val="Compact"/>
+              <w:jc w:val="left"/>
+            </w:pPr>
+            <w:r>
+              <w:t xml:space="preserve">Pre-March win pct</w:t>
+            </w:r>
+          </w:p>
+        </w:tc>
+        <w:tc>
+          <w:tcPr/>
+          <w:p>
+            <w:pPr>
+              <w:pStyle w:val="Compact"/>
+              <w:jc w:val="right"/>
+            </w:pPr>
+            <w:r>
+              <w:t xml:space="preserve">-0.453</w:t>
+            </w:r>
+          </w:p>
+        </w:tc>
+        <w:tc>
+          <w:tcPr/>
+          <w:p>
+            <w:pPr>
+              <w:pStyle w:val="Compact"/>
+              <w:jc w:val="right"/>
+            </w:pPr>
+            <w:r>
+              <w:t xml:space="preserve">0.196</w:t>
+            </w:r>
+          </w:p>
+        </w:tc>
+        <w:tc>
+          <w:tcPr/>
+          <w:p>
+            <w:pPr>
+              <w:pStyle w:val="Compact"/>
+              <w:jc w:val="right"/>
+            </w:pPr>
+            <w:r>
+              <w:t xml:space="preserve">0.022</w:t>
+            </w:r>
+          </w:p>
+        </w:tc>
+      </w:tr>
+      <w:tr>
+        <w:tc>
+          <w:tcPr/>
+          <w:p>
+            <w:pPr>
+              <w:pStyle w:val="Compact"/>
+              <w:jc w:val="left"/>
+            </w:pPr>
+            <w:r>
+              <w:t xml:space="preserve">Late low-win score</w:t>
+            </w:r>
+          </w:p>
+        </w:tc>
+        <w:tc>
+          <w:tcPr/>
+          <w:p>
+            <w:pPr>
+              <w:pStyle w:val="Compact"/>
+              <w:jc w:val="left"/>
+            </w:pPr>
+            <w:r>
+              <w:t xml:space="preserve">Disrupted season</w:t>
+            </w:r>
+          </w:p>
+        </w:tc>
+        <w:tc>
+          <w:tcPr/>
+          <w:p>
+            <w:pPr>
+              <w:pStyle w:val="Compact"/>
+              <w:jc w:val="right"/>
+            </w:pPr>
+            <w:r>
+              <w:t xml:space="preserve">-0.029</w:t>
+            </w:r>
+          </w:p>
+        </w:tc>
+        <w:tc>
+          <w:tcPr/>
+          <w:p>
+            <w:pPr>
+              <w:pStyle w:val="Compact"/>
+              <w:jc w:val="right"/>
+            </w:pPr>
+            <w:r>
+              <w:t xml:space="preserve">0.026</w:t>
+            </w:r>
+          </w:p>
+        </w:tc>
+        <w:tc>
+          <w:tcPr/>
+          <w:p>
+            <w:pPr>
+              <w:pStyle w:val="Compact"/>
+              <w:jc w:val="right"/>
+            </w:pPr>
+            <w:r>
+              <w:t xml:space="preserve">0.272</w:t>
+            </w:r>
+          </w:p>
+        </w:tc>
+      </w:tr>
+      <w:tr>
+        <w:tc>
+          <w:tcPr/>
+          <w:p>
+            <w:pPr>
+              <w:pStyle w:val="Compact"/>
+              <w:jc w:val="left"/>
+            </w:pPr>
+            <w:r>
+              <w:t xml:space="preserve">Late low-win score</w:t>
+            </w:r>
+          </w:p>
+        </w:tc>
+        <w:tc>
+          <w:tcPr/>
+          <w:p>
+            <w:pPr>
+              <w:pStyle w:val="Compact"/>
+              <w:jc w:val="left"/>
+            </w:pPr>
+            <w:r>
+              <w:t xml:space="preserve">Draft rating x post-reform</w:t>
+            </w:r>
+          </w:p>
+        </w:tc>
+        <w:tc>
+          <w:tcPr/>
+          <w:p>
+            <w:pPr>
+              <w:pStyle w:val="Compact"/>
+              <w:jc w:val="right"/>
+            </w:pPr>
+            <w:r>
+              <w:t xml:space="preserve">0.024</w:t>
+            </w:r>
+          </w:p>
+        </w:tc>
+        <w:tc>
+          <w:tcPr/>
+          <w:p>
+            <w:pPr>
+              <w:pStyle w:val="Compact"/>
+              <w:jc w:val="right"/>
+            </w:pPr>
+            <w:r>
+              <w:t xml:space="preserve">0.029</w:t>
+            </w:r>
+          </w:p>
+        </w:tc>
+        <w:tc>
+          <w:tcPr/>
+          <w:p>
+            <w:pPr>
+              <w:pStyle w:val="Compact"/>
+              <w:jc w:val="right"/>
+            </w:pPr>
+            <w:r>
+              <w:t xml:space="preserve">0.396</w:t>
+            </w:r>
+          </w:p>
+        </w:tc>
+      </w:tr>
+    </w:tbl>
+    <w:p>
+      <w:pPr>
+        <w:pStyle w:val="BodyText"/>
+      </w:pPr>
+      <w:r>
+        <w:t xml:space="preserve">The model does not provide strong statistical evidence that draft strength predicts late-season underperformance across the full 2010-2026 period. In the tanking-index model, the pre-reform draft-rating coefficient is -0.127, while the post-reform interaction is 0.316 with a p-value of 0.35. This means the estimated draft-strength relationship is more positive after the 2019 reform, but the difference is not statistically significant at conventional levels. The implied post-reform draft-rating slope is about 0.188 tanking-index units for a one-standard-deviation increase in draft class rating.</w:t>
+      </w:r>
+    </w:p>
+    <w:p>
+      <w:pPr>
+        <w:pStyle w:val="BodyText"/>
+      </w:pPr>
+      <w:r>
+        <w:t xml:space="preserve">The secondary</w:t>
+      </w:r>
+      <w:r>
+        <w:t xml:space="preserve"> </w:t>
+      </w:r>
+      <w:r>
+        <w:rPr>
+          <w:rStyle w:val="VerbatimChar"/>
+        </w:rPr>
+        <w:t xml:space="preserve">late_low_win_score</w:t>
+      </w:r>
+      <w:r>
+        <w:t xml:space="preserve"> </w:t>
+      </w:r>
+      <w:r>
+        <w:t xml:space="preserve">model tells a similar story. It is included because it is more sensitive to lower-left teams in Figure 1: teams that were already weak before March and continued to perform poorly late in the year. The post-reform draft-strength interaction is again positive, but still not statistically decisive. Overall, the results support a cautious conclusion: stronger draft classes may be associated with more late-season underperformance in the post-reform era, but the evidence is suggestive rather than conclusive.</w:t>
+      </w:r>
+    </w:p>
+    <w:bookmarkEnd w:id="34"/>
+    <w:bookmarkStart w:id="35" w:name="discussion"/>
     <w:p>
       <w:pPr>
         <w:pStyle w:val="Heading2"/>
       </w:pPr>
       <w:r>
-        <w:t xml:space="preserve">Anticipated Challenges</w:t>
+        <w:t xml:space="preserve">Discussion</w:t>
       </w:r>
     </w:p>
     <w:p>
@@ -781,10 +2002,260 @@
         <w:pStyle w:val="FirstParagraph"/>
       </w:pPr>
       <w:r>
-        <w:t xml:space="preserve">Moving forward, we will likely see a few challenges: the 2011-2012 season, similar to the 2021 season, was cut short. It only included 66 games instead of 82, and while this should be enough to compare well to other years, we will still need to check to see if it is a major outlier. Another issue could be large differences in dates of certain events, such as the trade deadline being on different days each year and the all-star break also being on different days, though in general these should lie within the same week annually. In general, the biggest challenge with this project is that tanking isn’t directly observable. To address this, we will describe the outcome as a proxy, include control variables where possible, and test whether the results are robust under multiple definitions. If we were to compare 2019-2026 data to 2010-2018 and use a non-linear approach, we may run into challenges interpreting the differences between the outcomes of the models and giving them any sort of real meaning. </w:t>
-      </w:r>
-    </w:p>
-    <w:bookmarkEnd w:id="31"/>
+        <w:t xml:space="preserve">The main finding is that the relationship between draft strength and late-season underperformance appears stronger after the 2019 lottery reform, but the model does not estimate that change precisely enough to make a strong causal claim. This is still useful because it clarifies the story the data can support. The project does not show that teams definitely tank more in strong draft years. Instead, it shows that a draft-quality based tanking signal is plausible, especially after 2019, and that the signal deserves more careful measurement.</w:t>
+      </w:r>
+    </w:p>
+    <w:p>
+      <w:pPr>
+        <w:pStyle w:val="BodyText"/>
+      </w:pPr>
+      <w:r>
+        <w:t xml:space="preserve">The analysis also shows why the definition of tanking matters. A strict late-collapse proxy flags only a small number of team-seasons. That makes the proxy conservative, but it can miss teams that were already very weak and remained very weak. The lower-left and late-low-win measures help address this by capturing sustained poor late-season performance. For the final interpretation, we should treat these as complementary signals rather than competing definitions.</w:t>
+      </w:r>
+    </w:p>
+    <w:p>
+      <w:pPr>
+        <w:pStyle w:val="BodyText"/>
+      </w:pPr>
+      <w:r>
+        <w:t xml:space="preserve">The 2021 season remains an important case. Several teams underperformed sharply late in the season, but that year was shortened and affected by COVID-era scheduling and player availability. Rather than deleting 2021, the model includes a disrupted-season control. This keeps the observation in the analysis while acknowledging that it may not be comparable to a normal 82-game season.</w:t>
+      </w:r>
+    </w:p>
+    <w:bookmarkEnd w:id="35"/>
+    <w:bookmarkStart w:id="36" w:name="limitations-and-future-work"/>
+    <w:p>
+      <w:pPr>
+        <w:pStyle w:val="Heading2"/>
+      </w:pPr>
+      <w:r>
+        <w:t xml:space="preserve">Limitations and Future Work</w:t>
+      </w:r>
+    </w:p>
+    <w:p>
+      <w:pPr>
+        <w:pStyle w:val="FirstParagraph"/>
+      </w:pPr>
+      <w:r>
+        <w:t xml:space="preserve">The biggest limitation is that tanking is not directly observable. We can observe losses, late-season underperformance, and playoff context, but we cannot observe whether a front office intended to lose. For that reason, all outcomes in this report should be interpreted as tanking proxies or tanking signals.</w:t>
+      </w:r>
+    </w:p>
+    <w:p>
+      <w:pPr>
+        <w:pStyle w:val="BodyText"/>
+      </w:pPr>
+      <w:r>
+        <w:t xml:space="preserve">A second limitation is that draft strength varies by season, not by team. Even after expanding the data to 2010-2026, there are only 17 draft-class observations. The team-season structure gives us more information about which teams were in position to tank, but it does not create 510 independent draft-strength observations.</w:t>
+      </w:r>
+    </w:p>
+    <w:p>
+      <w:pPr>
+        <w:pStyle w:val="BodyText"/>
+      </w:pPr>
+      <w:r>
+        <w:t xml:space="preserve">A third limitation is that our current model does not directly measure player resting. One peer-review suggestion was to add a variable for whether teams benched starters or reduced minutes for their best players late in the season. That would be a strong addition. A practical version would use player game logs to identify each team’s top pre-March minute players, then measure whether those players’ minutes or games played dropped sharply after March. This would help separate strategic late-season roster management from ordinary losing.</w:t>
+      </w:r>
+    </w:p>
+    <w:p>
+      <w:pPr>
+        <w:pStyle w:val="BodyText"/>
+      </w:pPr>
+      <w:r>
+        <w:t xml:space="preserve">Finally, the CraftedNBA rating is useful because it gives one consistent external measure of draft class quality, but it is still one source’s model-based ranking. Future versions should test whether results change when draft strength is measured by top-prospect rating, number of elite prospects, consensus mock draft rankings, or later NBA outcomes such as win shares.</w:t>
+      </w:r>
+    </w:p>
+    <w:bookmarkEnd w:id="36"/>
+    <w:bookmarkStart w:id="37" w:name="conclusion"/>
+    <w:p>
+      <w:pPr>
+        <w:pStyle w:val="Heading2"/>
+      </w:pPr>
+      <w:r>
+        <w:t xml:space="preserve">Conclusion</w:t>
+      </w:r>
+    </w:p>
+    <w:p>
+      <w:pPr>
+        <w:pStyle w:val="FirstParagraph"/>
+      </w:pPr>
+      <w:r>
+        <w:t xml:space="preserve">This project finds suggestive but not conclusive evidence that draft class strength may be more related to late-season underperformance after the NBA flattened lottery odds in 2019. The strongest visual evidence comes from the post-reform seasons, especially 2025 and 2026, where strong draft classes line up with higher average tanking-index values among likely lottery candidates. The regression model points in the same direction, but the interaction is not statistically significant.</w:t>
+      </w:r>
+    </w:p>
+    <w:p>
+      <w:pPr>
+        <w:pStyle w:val="BodyText"/>
+      </w:pPr>
+      <w:r>
+        <w:t xml:space="preserve">The most defensible conclusion is therefore cautious: draft class quality appears relevant to tanking incentives, but the current evidence is better viewed as an early signal than as proof. The project improves on simpler tanking analyses by combining playoff context, within-season underperformance, draft class quality, and the 2019 lottery reform into one framework.</w:t>
+      </w:r>
+    </w:p>
+    <w:bookmarkEnd w:id="37"/>
+    <w:bookmarkStart w:id="39" w:name="references"/>
+    <w:p>
+      <w:pPr>
+        <w:pStyle w:val="Heading2"/>
+      </w:pPr>
+      <w:r>
+        <w:t xml:space="preserve">References</w:t>
+      </w:r>
+    </w:p>
+    <w:p>
+      <w:pPr>
+        <w:pStyle w:val="Compact"/>
+        <w:numPr>
+          <w:ilvl w:val="0"/>
+          <w:numId w:val="1002"/>
+        </w:numPr>
+      </w:pPr>
+      <w:r>
+        <w:t xml:space="preserve">CraftedNBA.</w:t>
+      </w:r>
+      <w:r>
+        <w:t xml:space="preserve"> </w:t>
+      </w:r>
+      <w:hyperlink r:id="rId25">
+        <w:r>
+          <w:rPr>
+            <w:rStyle w:val="Hyperlink"/>
+          </w:rPr>
+          <w:t xml:space="preserve">Draft Class Rankings</w:t>
+        </w:r>
+      </w:hyperlink>
+      <w:r>
+        <w:t xml:space="preserve">.</w:t>
+      </w:r>
+    </w:p>
+    <w:p>
+      <w:pPr>
+        <w:pStyle w:val="Compact"/>
+        <w:numPr>
+          <w:ilvl w:val="0"/>
+          <w:numId w:val="1002"/>
+        </w:numPr>
+      </w:pPr>
+      <w:r>
+        <w:t xml:space="preserve">hoopR.</w:t>
+      </w:r>
+      <w:r>
+        <w:t xml:space="preserve"> </w:t>
+      </w:r>
+      <w:hyperlink r:id="rId24">
+        <w:r>
+          <w:rPr>
+            <w:rStyle w:val="Hyperlink"/>
+          </w:rPr>
+          <w:t xml:space="preserve">SportsDataverse hoopR package</w:t>
+        </w:r>
+      </w:hyperlink>
+      <w:r>
+        <w:t xml:space="preserve">.</w:t>
+      </w:r>
+    </w:p>
+    <w:p>
+      <w:pPr>
+        <w:pStyle w:val="Compact"/>
+        <w:numPr>
+          <w:ilvl w:val="0"/>
+          <w:numId w:val="1002"/>
+        </w:numPr>
+      </w:pPr>
+      <w:r>
+        <w:t xml:space="preserve">NBA.com.</w:t>
+      </w:r>
+      <w:r>
+        <w:t xml:space="preserve"> </w:t>
+      </w:r>
+      <w:hyperlink r:id="rId22">
+        <w:r>
+          <w:rPr>
+            <w:rStyle w:val="Hyperlink"/>
+          </w:rPr>
+          <w:t xml:space="preserve">NBA Board of Governors approves changes to Draft Lottery system</w:t>
+        </w:r>
+      </w:hyperlink>
+      <w:r>
+        <w:t xml:space="preserve">.</w:t>
+      </w:r>
+    </w:p>
+    <w:p>
+      <w:pPr>
+        <w:pStyle w:val="Compact"/>
+        <w:numPr>
+          <w:ilvl w:val="0"/>
+          <w:numId w:val="1002"/>
+        </w:numPr>
+      </w:pPr>
+      <w:r>
+        <w:t xml:space="preserve">NBA.com.</w:t>
+      </w:r>
+      <w:r>
+        <w:t xml:space="preserve"> </w:t>
+      </w:r>
+      <w:hyperlink r:id="rId38">
+        <w:r>
+          <w:rPr>
+            <w:rStyle w:val="Hyperlink"/>
+          </w:rPr>
+          <w:t xml:space="preserve">NBA Draft Lottery explainer</w:t>
+        </w:r>
+      </w:hyperlink>
+      <w:r>
+        <w:t xml:space="preserve">.</w:t>
+      </w:r>
+    </w:p>
+    <w:p>
+      <w:pPr>
+        <w:pStyle w:val="Compact"/>
+        <w:numPr>
+          <w:ilvl w:val="0"/>
+          <w:numId w:val="1002"/>
+        </w:numPr>
+      </w:pPr>
+      <w:r>
+        <w:t xml:space="preserve">Price, J., Soebbing, B. P., Berri, D., &amp; Humphreys, B. R. (2010).</w:t>
+      </w:r>
+      <w:r>
+        <w:t xml:space="preserve"> </w:t>
+      </w:r>
+      <w:hyperlink r:id="rId21">
+        <w:r>
+          <w:rPr>
+            <w:rStyle w:val="Hyperlink"/>
+          </w:rPr>
+          <w:t xml:space="preserve">Tournament Incentives, League Policy, and NBA Team Performance Revisited</w:t>
+        </w:r>
+      </w:hyperlink>
+      <w:r>
+        <w:t xml:space="preserve">.</w:t>
+      </w:r>
+    </w:p>
+    <w:p>
+      <w:pPr>
+        <w:pStyle w:val="Compact"/>
+        <w:numPr>
+          <w:ilvl w:val="0"/>
+          <w:numId w:val="1002"/>
+        </w:numPr>
+      </w:pPr>
+      <w:r>
+        <w:t xml:space="preserve">Taylor, B. A., &amp; Trogdon, J. G. (2002).</w:t>
+      </w:r>
+      <w:r>
+        <w:t xml:space="preserve"> </w:t>
+      </w:r>
+      <w:hyperlink r:id="rId20">
+        <w:r>
+          <w:rPr>
+            <w:rStyle w:val="Hyperlink"/>
+          </w:rPr>
+          <w:t xml:space="preserve">Losing to Win: Tournament Incentives in the National Basketball Association</w:t>
+        </w:r>
+      </w:hyperlink>
+      <w:r>
+        <w:t xml:space="preserve">.</w:t>
+      </w:r>
+    </w:p>
+    <w:bookmarkEnd w:id="39"/>
     <w:sectPr>
       <w:footnotePr>
         <w:numRestart w:val="eachSect"/>
@@ -895,91 +2366,6 @@
       </w:pPr>
     </w:lvl>
   </w:abstractNum>
-  <w:abstractNum w:abstractNumId="99411">
-    <w:nsid w:val="00A99411"/>
-    <w:multiLevelType w:val="multilevel"/>
-    <w:lvl w:ilvl="0">
-      <w:start w:val="1"/>
-      <w:numFmt w:val="decimal"/>
-      <w:lvlText w:val="%1."/>
-      <w:lvlJc w:val="left"/>
-      <w:pPr>
-        <w:ind w:left="720" w:hanging="360"/>
-      </w:pPr>
-    </w:lvl>
-    <w:lvl w:ilvl="1">
-      <w:start w:val="1"/>
-      <w:numFmt w:val="decimal"/>
-      <w:lvlText w:val="%2."/>
-      <w:lvlJc w:val="left"/>
-      <w:pPr>
-        <w:ind w:left="1440" w:hanging="360"/>
-      </w:pPr>
-    </w:lvl>
-    <w:lvl w:ilvl="2">
-      <w:start w:val="1"/>
-      <w:numFmt w:val="decimal"/>
-      <w:lvlText w:val="%3."/>
-      <w:lvlJc w:val="left"/>
-      <w:pPr>
-        <w:ind w:left="2160" w:hanging="360"/>
-      </w:pPr>
-    </w:lvl>
-    <w:lvl w:ilvl="3">
-      <w:start w:val="1"/>
-      <w:numFmt w:val="decimal"/>
-      <w:lvlText w:val="%4."/>
-      <w:lvlJc w:val="left"/>
-      <w:pPr>
-        <w:ind w:left="2880" w:hanging="360"/>
-      </w:pPr>
-    </w:lvl>
-    <w:lvl w:ilvl="4">
-      <w:start w:val="1"/>
-      <w:numFmt w:val="decimal"/>
-      <w:lvlText w:val="%5."/>
-      <w:lvlJc w:val="left"/>
-      <w:pPr>
-        <w:ind w:left="3600" w:hanging="360"/>
-      </w:pPr>
-    </w:lvl>
-    <w:lvl w:ilvl="5">
-      <w:start w:val="1"/>
-      <w:numFmt w:val="decimal"/>
-      <w:lvlText w:val="%6."/>
-      <w:lvlJc w:val="left"/>
-      <w:pPr>
-        <w:ind w:left="4320" w:hanging="360"/>
-      </w:pPr>
-    </w:lvl>
-    <w:lvl w:ilvl="6">
-      <w:start w:val="1"/>
-      <w:numFmt w:val="decimal"/>
-      <w:lvlText w:val="%7."/>
-      <w:lvlJc w:val="left"/>
-      <w:pPr>
-        <w:ind w:left="5040" w:hanging="360"/>
-      </w:pPr>
-    </w:lvl>
-    <w:lvl w:ilvl="7">
-      <w:start w:val="1"/>
-      <w:numFmt w:val="decimal"/>
-      <w:lvlText w:val="%8."/>
-      <w:lvlJc w:val="left"/>
-      <w:pPr>
-        <w:ind w:left="5760" w:hanging="360"/>
-      </w:pPr>
-    </w:lvl>
-    <w:lvl w:ilvl="8">
-      <w:start w:val="1"/>
-      <w:numFmt w:val="decimal"/>
-      <w:lvlText w:val="%9."/>
-      <w:lvlJc w:val="left"/>
-      <w:pPr>
-        <w:ind w:left="6480" w:hanging="360"/>
-      </w:pPr>
-    </w:lvl>
-  </w:abstractNum>
   <w:abstractNum w:abstractNumId="991">
     <w:nsid w:val="0000A991"/>
     <w:multiLevelType w:val="multilevel"/>
@@ -1087,34 +2473,7 @@
     <w:abstractNumId w:val="990"/>
   </w:num>
   <w:num w:numId="1001">
-    <w:abstractNumId w:val="99411"/>
-    <w:lvlOverride w:ilvl="0">
-      <w:startOverride w:val="1"/>
-    </w:lvlOverride>
-    <w:lvlOverride w:ilvl="1">
-      <w:startOverride w:val="1"/>
-    </w:lvlOverride>
-    <w:lvlOverride w:ilvl="2">
-      <w:startOverride w:val="1"/>
-    </w:lvlOverride>
-    <w:lvlOverride w:ilvl="3">
-      <w:startOverride w:val="1"/>
-    </w:lvlOverride>
-    <w:lvlOverride w:ilvl="4">
-      <w:startOverride w:val="1"/>
-    </w:lvlOverride>
-    <w:lvlOverride w:ilvl="5">
-      <w:startOverride w:val="1"/>
-    </w:lvlOverride>
-    <w:lvlOverride w:ilvl="6">
-      <w:startOverride w:val="1"/>
-    </w:lvlOverride>
-    <w:lvlOverride w:ilvl="7">
-      <w:startOverride w:val="1"/>
-    </w:lvlOverride>
-    <w:lvlOverride w:ilvl="8">
-      <w:startOverride w:val="1"/>
-    </w:lvlOverride>
+    <w:abstractNumId w:val="991"/>
   </w:num>
   <w:num w:numId="1002">
     <w:abstractNumId w:val="991"/>

</xml_diff>